<commit_message>
feat: finalize facility agreement version
- Added SWIFT codes for existing banks.
- facility_agreement_date set to date of creation of the document.
- Added Account Number into facility agreement.
- Schedules 4 - 9 left as just a reference.
</commit_message>
<xml_diff>
--- a/apps/api/src/modules/applications/templates/arf-facility-agreement.docx
+++ b/apps/api/src/modules/applications/templates/arf-facility-agreement.docx
@@ -14507,17 +14507,7 @@
           <w:tcPr>
             <w:tcW w:w="5527" w:type="dxa"/>
           </w:tcPr>
-          <w:p>
-            <w:r>
-              <w:rPr>
-                <w:rFonts w:ascii="Arial" w:hAnsi="Arial"/>
-                <w:sz w:val="20"/>
-                <w:szCs w:val="20"/>
-                <w:highlight w:val="yellow"/>
-              </w:rPr>
-              <w:t>{issuer_bank_branch}</w:t>
-            </w:r>
-          </w:p>
+          <w:p/>
           <w:p/>
         </w:tc>
       </w:tr>
@@ -14553,6 +14543,60 @@
                 <w:b/>
                 <w:bCs/>
               </w:rPr>
+              <w:t>Account Number</w:t>
+            </w:r>
+          </w:p>
+        </w:tc>
+        <w:tc>
+          <w:tcPr>
+            <w:tcW w:w="5527" w:type="dxa"/>
+          </w:tcPr>
+          <w:p>
+            <w:r>
+              <w:rPr>
+                <w:rFonts w:ascii="Arial" w:hAnsi="Arial"/>
+                <w:sz w:val="20"/>
+                <w:szCs w:val="20"/>
+                <w:highlight w:val="yellow"/>
+              </w:rPr>
+              <w:t>{issuer_bank_account_number}</w:t>
+            </w:r>
+          </w:p>
+          <w:p/>
+        </w:tc>
+      </w:tr>
+      <w:tr>
+        <w:tc>
+          <w:tcPr>
+            <w:tcW w:w="1010" w:type="dxa"/>
+            <w:vMerge/>
+          </w:tcPr>
+          <w:p>
+            <w:pPr>
+              <w:jc w:val="center"/>
+              <w:rPr>
+                <w:b/>
+                <w:bCs/>
+              </w:rPr>
+            </w:pPr>
+          </w:p>
+        </w:tc>
+        <w:tc>
+          <w:tcPr>
+            <w:tcW w:w="2813" w:type="dxa"/>
+          </w:tcPr>
+          <w:p>
+            <w:pPr>
+              <w:rPr>
+                <w:b/>
+                <w:bCs/>
+              </w:rPr>
+            </w:pPr>
+            <w:r>
+              <w:rPr>
+                <w:b/>
+                <w:bCs/>
+              </w:rPr>
               <w:t>Account Name</w:t>
             </w:r>
           </w:p>
@@ -14761,21 +14805,11 @@
         <w:spacing w:after="0" w:line="240" w:lineRule="auto"/>
       </w:pPr>
       <w:r>
-        <w:rPr>
-          <w:rFonts w:ascii="Arial" w:hAnsi="Arial"/>
-          <w:sz w:val="20"/>
-          <w:szCs w:val="20"/>
-        </w:rPr>
-        <w:t xml:space="preserve">From : </w:t>
-      </w:r>
-      <w:r>
-        <w:rPr>
-          <w:rFonts w:ascii="Arial" w:hAnsi="Arial"/>
-          <w:sz w:val="20"/>
-          <w:szCs w:val="20"/>
-          <w:highlight w:val="yellow"/>
-        </w:rPr>
-        <w:t>{issuer_name}</w:t>
+        <w:t>From</w:t>
+      </w:r>
+      <w:r>
+        <w:tab/>
+        <w:t>:</w:t>
       </w:r>
     </w:p>
     <w:p>
@@ -14832,9 +14866,8 @@
         <w:rPr>
           <w:b/>
           <w:bCs/>
-          <w:highlight w:val="yellow"/>
-        </w:rPr>
-        <w:t>{issuer_name}</w:t>
+        </w:rPr>
+        <w:t>[ISSUER NAME]</w:t>
       </w:r>
     </w:p>
     <w:p>
@@ -14850,49 +14883,28 @@
           <w:b/>
           <w:bCs/>
         </w:rPr>
-        <w:t xml:space="preserve">- Accounts Receivable Financing-i Agreement dated </w:t>
-      </w:r>
-      <w:r>
-        <w:rPr>
-          <w:b/>
-          <w:bCs/>
-          <w:highlight w:val="yellow"/>
-        </w:rPr>
-        <w:t>{facility_agreement_date}</w:t>
-      </w:r>
-      <w:r>
-        <w:rPr>
-          <w:b/>
-          <w:bCs/>
-        </w:rPr>
-        <w:t xml:space="preserve"> </w:t>
-      </w:r>
-      <w:r>
-        <w:rPr>
-          <w:b/>
-          <w:bCs/>
-        </w:rPr>
-        <w:tab/>
-      </w:r>
-      <w:r>
-        <w:rPr>
-          <w:b/>
-          <w:bCs/>
-        </w:rPr>
-        <w:tab/>
-      </w:r>
-      <w:r>
-        <w:rPr>
-          <w:b/>
-          <w:bCs/>
-        </w:rPr>
-        <w:tab/>
-      </w:r>
-      <w:r>
-        <w:rPr>
-          <w:b/>
-          <w:bCs/>
-        </w:rPr>
+        <w:t>- Accounts Receivable Financing-i Agreement dated</w:t>
+      </w:r>
+      <w:r>
+        <w:rPr>
+          <w:b/>
+          <w:bCs/>
+        </w:rPr>
+        <w:tab/>
+      </w:r>
+      <w:r>
+        <w:rPr>
+          <w:b/>
+          <w:bCs/>
+        </w:rPr>
+        <w:tab/>
+      </w:r>
+      <w:r>
+        <w:rPr>
+          <w:b/>
+          <w:bCs/>
+        </w:rPr>
+        <w:tab/>
         <w:t>(the “Facility Agreement”)</w:t>
       </w:r>
     </w:p>
@@ -15134,13 +15146,23 @@
         <w:spacing w:after="0" w:line="240" w:lineRule="auto"/>
       </w:pPr>
       <w:r>
-        <w:rPr>
-          <w:rFonts w:ascii="Arial" w:hAnsi="Arial"/>
-          <w:sz w:val="20"/>
-          <w:szCs w:val="20"/>
-          <w:highlight w:val="yellow"/>
-        </w:rPr>
-        <w:t>{issuer_name}</w:t>
+        <w:t>[</w:t>
+      </w:r>
+      <w:r>
+        <w:tab/>
+      </w:r>
+      <w:r>
+        <w:tab/>
+      </w:r>
+      <w:r>
+        <w:tab/>
+      </w:r>
+      <w:r>
+        <w:tab/>
+      </w:r>
+      <w:r>
+        <w:tab/>
+        <w:t>]</w:t>
       </w:r>
     </w:p>
     <w:p>
@@ -15311,13 +15333,20 @@
         <w:jc w:val="center"/>
       </w:pPr>
       <w:r>
-        <w:rPr>
-          <w:rFonts w:ascii="Arial" w:hAnsi="Arial"/>
-          <w:sz w:val="20"/>
-          <w:szCs w:val="20"/>
-          <w:highlight w:val="yellow"/>
-        </w:rPr>
-        <w:t>{issuer_name}</w:t>
+        <w:t>[</w:t>
+      </w:r>
+      <w:r>
+        <w:tab/>
+      </w:r>
+      <w:r>
+        <w:tab/>
+      </w:r>
+      <w:r>
+        <w:tab/>
+      </w:r>
+      <w:r>
+        <w:tab/>
+        <w:t>]</w:t>
       </w:r>
     </w:p>
     <w:p>
@@ -15326,13 +15355,7 @@
         <w:jc w:val="center"/>
       </w:pPr>
       <w:r>
-        <w:rPr>
-          <w:rFonts w:ascii="Arial" w:hAnsi="Arial"/>
-          <w:sz w:val="20"/>
-          <w:szCs w:val="20"/>
-          <w:highlight w:val="yellow"/>
-        </w:rPr>
-        <w:t>{issuer_address}</w:t>
+        <w:t>[Issuer’s Address]</w:t>
       </w:r>
     </w:p>
     <w:p>
@@ -15508,94 +15531,33 @@
         <w:ind w:left="1418" w:hanging="709"/>
       </w:pPr>
       <w:r>
-        <w:rPr>
-          <w:rFonts w:ascii="Arial" w:hAnsi="Arial"/>
-          <w:sz w:val="20"/>
-          <w:szCs w:val="20"/>
-        </w:rPr>
-        <w:t xml:space="preserve">is issued subject to the terms and conditions set out in the Facility Agreement dated </w:t>
-      </w:r>
-      <w:r>
-        <w:rPr>
-          <w:rFonts w:ascii="Arial" w:hAnsi="Arial"/>
-          <w:sz w:val="20"/>
-          <w:szCs w:val="20"/>
-          <w:highlight w:val="yellow"/>
-        </w:rPr>
-        <w:t>{facility_agreement_date}</w:t>
-      </w:r>
-      <w:r>
-        <w:rPr>
-          <w:rFonts w:ascii="Arial" w:hAnsi="Arial"/>
-          <w:sz w:val="20"/>
-          <w:szCs w:val="20"/>
-        </w:rPr>
-        <w:t xml:space="preserve"> </w:t>
-      </w:r>
-      <w:r>
-        <w:rPr>
-          <w:rFonts w:ascii="Arial" w:hAnsi="Arial"/>
-          <w:sz w:val="20"/>
-          <w:szCs w:val="20"/>
-        </w:rPr>
-        <w:tab/>
-      </w:r>
-      <w:r>
-        <w:rPr>
-          <w:rFonts w:ascii="Arial" w:hAnsi="Arial"/>
-          <w:sz w:val="20"/>
-          <w:szCs w:val="20"/>
-        </w:rPr>
-        <w:tab/>
-      </w:r>
-      <w:r>
-        <w:rPr>
-          <w:rFonts w:ascii="Arial" w:hAnsi="Arial"/>
-          <w:sz w:val="20"/>
-          <w:szCs w:val="20"/>
-        </w:rPr>
-        <w:tab/>
-      </w:r>
-      <w:r>
-        <w:rPr>
-          <w:rFonts w:ascii="Arial" w:hAnsi="Arial"/>
-          <w:sz w:val="20"/>
-          <w:szCs w:val="20"/>
-        </w:rPr>
-        <w:tab/>
-      </w:r>
-      <w:r>
-        <w:rPr>
-          <w:rFonts w:ascii="Arial" w:hAnsi="Arial"/>
-          <w:sz w:val="20"/>
-          <w:szCs w:val="20"/>
-        </w:rPr>
-        <w:tab/>
-      </w:r>
-      <w:r>
-        <w:rPr>
-          <w:rFonts w:ascii="Arial" w:hAnsi="Arial"/>
-          <w:sz w:val="20"/>
-          <w:szCs w:val="20"/>
-        </w:rPr>
-        <w:t xml:space="preserve">made between (i) </w:t>
-      </w:r>
-      <w:r>
-        <w:rPr>
-          <w:rFonts w:ascii="Arial" w:hAnsi="Arial"/>
-          <w:sz w:val="20"/>
-          <w:szCs w:val="20"/>
-          <w:highlight w:val="yellow"/>
-        </w:rPr>
-        <w:t>{issuer_name}</w:t>
-      </w:r>
-      <w:r>
-        <w:rPr>
-          <w:rFonts w:ascii="Arial" w:hAnsi="Arial"/>
-          <w:sz w:val="20"/>
-          <w:szCs w:val="20"/>
-        </w:rPr>
-        <w:t xml:space="preserve"> as the Issuer, (ii) the person named in Schedule 1 to the Facility Agreement as the Investors and (iii) Shoraka Suyula Platform Sdn Bhd as the Agent.</w:t>
+        <w:t>is issued subject to the terms and conditions set out in the Facility Agreement dated</w:t>
+      </w:r>
+      <w:r>
+        <w:tab/>
+      </w:r>
+      <w:r>
+        <w:tab/>
+      </w:r>
+      <w:r>
+        <w:tab/>
+      </w:r>
+      <w:r>
+        <w:tab/>
+      </w:r>
+      <w:r>
+        <w:tab/>
+        <w:t>made between (i)</w:t>
+      </w:r>
+      <w:r>
+        <w:tab/>
+      </w:r>
+      <w:r>
+        <w:tab/>
+      </w:r>
+      <w:r>
+        <w:tab/>
+        <w:t>as the Issuer, (ii) the person named in Schedule 1 to the Facility Agreement as the Investors and (iii) Shoraka Suyula Platform Sdn Bhd as the Agent.</w:t>
       </w:r>
     </w:p>
     <w:p>
@@ -16088,15 +16050,22 @@
           <w:b/>
           <w:bCs/>
         </w:rPr>
-        <w:t xml:space="preserve">From : </w:t>
-      </w:r>
-      <w:r>
-        <w:rPr>
-          <w:b/>
-          <w:bCs/>
-          <w:highlight w:val="yellow"/>
-        </w:rPr>
-        <w:t>{issuer_name}</w:t>
+        <w:t>From</w:t>
+      </w:r>
+      <w:r>
+        <w:rPr>
+          <w:b/>
+          <w:bCs/>
+        </w:rPr>
+        <w:tab/>
+        <w:t>:</w:t>
+      </w:r>
+      <w:r>
+        <w:rPr>
+          <w:b/>
+          <w:bCs/>
+        </w:rPr>
+        <w:tab/>
       </w:r>
     </w:p>
     <w:p>
@@ -16201,53 +16170,15 @@
         <w:spacing w:after="0" w:line="276" w:lineRule="auto"/>
       </w:pPr>
       <w:r>
-        <w:rPr>
-          <w:rFonts w:ascii="Arial" w:hAnsi="Arial"/>
-          <w:sz w:val="20"/>
-          <w:szCs w:val="20"/>
-        </w:rPr>
         <w:t>Re</w:t>
       </w:r>
       <w:r>
-        <w:rPr>
-          <w:rFonts w:ascii="Arial" w:hAnsi="Arial"/>
-          <w:sz w:val="20"/>
-          <w:szCs w:val="20"/>
-        </w:rPr>
-        <w:tab/>
-      </w:r>
-      <w:r>
-        <w:rPr>
-          <w:rFonts w:ascii="Arial" w:hAnsi="Arial"/>
-          <w:sz w:val="20"/>
-          <w:szCs w:val="20"/>
-        </w:rPr>
+        <w:tab/>
         <w:t>:</w:t>
       </w:r>
       <w:r>
-        <w:rPr>
-          <w:rFonts w:ascii="Arial" w:hAnsi="Arial"/>
-          <w:sz w:val="20"/>
-          <w:szCs w:val="20"/>
-        </w:rPr>
-        <w:tab/>
-      </w:r>
-      <w:r>
-        <w:rPr>
-          <w:rFonts w:ascii="Arial" w:hAnsi="Arial"/>
-          <w:sz w:val="20"/>
-          <w:szCs w:val="20"/>
-        </w:rPr>
-        <w:t xml:space="preserve">Letter of Offer dated </w:t>
-      </w:r>
-      <w:r>
-        <w:rPr>
-          <w:rFonts w:ascii="Arial" w:hAnsi="Arial"/>
-          <w:sz w:val="20"/>
-          <w:szCs w:val="20"/>
-          <w:highlight w:val="yellow"/>
-        </w:rPr>
-        <w:t>{letter_date}</w:t>
+        <w:tab/>
+        <w:t>Letter of Offer dated …………………..</w:t>
       </w:r>
     </w:p>
     <w:p>
@@ -16280,29 +16211,7 @@
         <w:jc w:val="both"/>
       </w:pPr>
       <w:r>
-        <w:rPr>
-          <w:rFonts w:ascii="Arial" w:hAnsi="Arial"/>
-          <w:sz w:val="20"/>
-          <w:szCs w:val="20"/>
-        </w:rPr>
-        <w:t xml:space="preserve">Account Receivable Financing-i Agreement dated </w:t>
-      </w:r>
-      <w:r>
-        <w:rPr>
-          <w:rFonts w:ascii="Arial" w:hAnsi="Arial"/>
-          <w:sz w:val="20"/>
-          <w:szCs w:val="20"/>
-          <w:highlight w:val="yellow"/>
-        </w:rPr>
-        <w:t>{facility_agreement_date}</w:t>
-      </w:r>
-      <w:r>
-        <w:rPr>
-          <w:rFonts w:ascii="Arial" w:hAnsi="Arial"/>
-          <w:sz w:val="20"/>
-          <w:szCs w:val="20"/>
-        </w:rPr>
-        <w:t xml:space="preserve"> (“Facility Agreement”)</w:t>
+        <w:t>Account Receivable Financing-i Agreement dated ………………….. (“Facility Agreement”)</w:t>
       </w:r>
     </w:p>
     <w:p>
@@ -16689,28 +16598,34 @@
         <w:jc w:val="both"/>
       </w:pPr>
       <w:r>
-        <w:rPr>
-          <w:rFonts w:ascii="Arial" w:hAnsi="Arial"/>
-          <w:sz w:val="20"/>
-          <w:szCs w:val="20"/>
+        <w:t>[</w:t>
+      </w:r>
+      <w:r>
+        <w:rPr>
           <w:highlight w:val="yellow"/>
         </w:rPr>
-        <w:t>{issuer_name}</w:t>
-      </w:r>
-    </w:p>
-    <w:p>
-      <w:pPr>
-        <w:spacing w:after="0" w:line="276" w:lineRule="auto"/>
-        <w:jc w:val="both"/>
-      </w:pPr>
-      <w:r>
-        <w:rPr>
-          <w:rFonts w:ascii="Arial" w:hAnsi="Arial"/>
-          <w:sz w:val="20"/>
-          <w:szCs w:val="20"/>
+        <w:t>insert</w:t>
+      </w:r>
+      <w:r>
+        <w:t>]</w:t>
+      </w:r>
+    </w:p>
+    <w:p>
+      <w:pPr>
+        <w:spacing w:after="0" w:line="276" w:lineRule="auto"/>
+        <w:jc w:val="both"/>
+      </w:pPr>
+      <w:r>
+        <w:t>[</w:t>
+      </w:r>
+      <w:r>
+        <w:rPr>
           <w:highlight w:val="yellow"/>
         </w:rPr>
-        <w:t>{issuer_registration_number}</w:t>
+        <w:t>insert</w:t>
+      </w:r>
+      <w:r>
+        <w:t>]</w:t>
       </w:r>
     </w:p>
     <w:p>
@@ -17143,40 +17058,44 @@
           <w:color w:val="000000" w:themeColor="text1"/>
         </w:rPr>
         <w:tab/>
+        <w:t xml:space="preserve">: </w:t>
       </w:r>
       <w:r>
         <w:rPr>
           <w:rFonts w:eastAsia="Arial" w:cs="Arial"/>
           <w:color w:val="000000" w:themeColor="text1"/>
         </w:rPr>
-        <w:t xml:space="preserve">: </w:t>
-      </w:r>
+        <w:tab/>
+      </w:r>
+      <w:r>
+        <w:t>[●]</w:t>
+      </w:r>
+    </w:p>
+    <w:p>
+      <w:pPr>
+        <w:jc w:val="both"/>
+      </w:pPr>
       <w:r>
         <w:rPr>
           <w:rFonts w:eastAsia="Arial" w:cs="Arial"/>
           <w:color w:val="000000" w:themeColor="text1"/>
         </w:rPr>
-        <w:tab/>
+        <w:t>Facility</w:t>
       </w:r>
       <w:r>
         <w:rPr>
           <w:rFonts w:eastAsia="Arial" w:cs="Arial"/>
           <w:color w:val="000000" w:themeColor="text1"/>
-          <w:highlight w:val="yellow"/>
-        </w:rPr>
-        <w:t>{issuer_name}</w:t>
-      </w:r>
-    </w:p>
-    <w:p>
-      <w:pPr>
-        <w:jc w:val="both"/>
-      </w:pPr>
+        </w:rPr>
+        <w:tab/>
+      </w:r>
       <w:r>
         <w:rPr>
           <w:rFonts w:eastAsia="Arial" w:cs="Arial"/>
           <w:color w:val="000000" w:themeColor="text1"/>
         </w:rPr>
-        <w:t>Facility</w:t>
+        <w:tab/>
+        <w:t xml:space="preserve">: </w:t>
       </w:r>
       <w:r>
         <w:rPr>
@@ -17186,18 +17105,23 @@
         <w:tab/>
       </w:r>
       <w:r>
+        <w:t>[●]</w:t>
+      </w:r>
+    </w:p>
+    <w:p>
+      <w:pPr>
+        <w:jc w:val="both"/>
         <w:rPr>
           <w:rFonts w:eastAsia="Arial" w:cs="Arial"/>
           <w:color w:val="000000" w:themeColor="text1"/>
         </w:rPr>
-        <w:tab/>
-      </w:r>
+      </w:pPr>
       <w:r>
         <w:rPr>
           <w:rFonts w:eastAsia="Arial" w:cs="Arial"/>
           <w:color w:val="000000" w:themeColor="text1"/>
         </w:rPr>
-        <w:t xml:space="preserve">: </w:t>
+        <w:t>Facility Agreement:</w:t>
       </w:r>
       <w:r>
         <w:rPr>
@@ -17207,43 +17131,7 @@
         <w:tab/>
       </w:r>
       <w:r>
-        <w:rPr>
-          <w:rFonts w:eastAsia="Arial" w:cs="Arial"/>
-          <w:color w:val="000000" w:themeColor="text1"/>
-          <w:highlight w:val="yellow"/>
-        </w:rPr>
-        <w:t>{facility_description}</w:t>
-      </w:r>
-    </w:p>
-    <w:p>
-      <w:pPr>
-        <w:jc w:val="both"/>
-        <w:rPr>
-          <w:rFonts w:eastAsia="Arial" w:cs="Arial"/>
-          <w:color w:val="000000" w:themeColor="text1"/>
-        </w:rPr>
-      </w:pPr>
-      <w:r>
-        <w:rPr>
-          <w:rFonts w:eastAsia="Arial" w:cs="Arial"/>
-          <w:color w:val="000000" w:themeColor="text1"/>
-        </w:rPr>
-        <w:t>Facility Agreement:</w:t>
-      </w:r>
-      <w:r>
-        <w:rPr>
-          <w:rFonts w:eastAsia="Arial" w:cs="Arial"/>
-          <w:color w:val="000000" w:themeColor="text1"/>
-        </w:rPr>
-        <w:tab/>
-      </w:r>
-      <w:r>
-        <w:rPr>
-          <w:rFonts w:eastAsia="Arial" w:cs="Arial"/>
-          <w:color w:val="000000" w:themeColor="text1"/>
-          <w:highlight w:val="yellow"/>
-        </w:rPr>
-        <w:t>{facility_agreement_date}</w:t>
+        <w:t>[●]</w:t>
       </w:r>
       <w:r>
         <w:rPr>
@@ -17274,22 +17162,23 @@
       </w:r>
       <w:r>
         <w:rPr>
-          <w:rFonts w:eastAsia="Arial" w:cs="Arial"/>
-          <w:color w:val="000000" w:themeColor="text1"/>
           <w:u w:val="single"/>
-          <w:lang w:val="en-US"/>
-          <w:highlight w:val="yellow"/>
-        </w:rPr>
-        <w:t>{letter_date}</w:t>
-      </w:r>
-      <w:r>
-        <w:rPr>
-          <w:rFonts w:eastAsia="Arial" w:cs="Arial"/>
-          <w:color w:val="000000" w:themeColor="text1"/>
+        </w:rPr>
+        <w:t>[●] (“</w:t>
+      </w:r>
+      <w:r>
+        <w:rPr>
+          <w:b/>
+          <w:bCs/>
           <w:u w:val="single"/>
-          <w:lang w:val="en-US"/>
-        </w:rPr>
-        <w:t xml:space="preserve"> (“Letter of Offer”)</w:t>
+        </w:rPr>
+        <w:t>Letter of Offer</w:t>
+      </w:r>
+      <w:r>
+        <w:rPr>
+          <w:u w:val="single"/>
+        </w:rPr>
+        <w:t>”)</w:t>
       </w:r>
     </w:p>
     <w:p>
@@ -18203,37 +18092,41 @@
           <w:color w:val="000000" w:themeColor="text1"/>
         </w:rPr>
         <w:tab/>
+        <w:t xml:space="preserve">: </w:t>
       </w:r>
       <w:r>
         <w:rPr>
           <w:rFonts w:eastAsia="Arial" w:cs="Arial"/>
           <w:color w:val="000000" w:themeColor="text1"/>
         </w:rPr>
-        <w:t xml:space="preserve">: </w:t>
-      </w:r>
+        <w:tab/>
+      </w:r>
+      <w:r>
+        <w:t>[●]</w:t>
+      </w:r>
+    </w:p>
+    <w:p>
       <w:r>
         <w:rPr>
           <w:rFonts w:eastAsia="Arial" w:cs="Arial"/>
           <w:color w:val="000000" w:themeColor="text1"/>
         </w:rPr>
-        <w:tab/>
+        <w:t>Facility</w:t>
       </w:r>
       <w:r>
         <w:rPr>
           <w:rFonts w:eastAsia="Arial" w:cs="Arial"/>
           <w:color w:val="000000" w:themeColor="text1"/>
-          <w:highlight w:val="yellow"/>
-        </w:rPr>
-        <w:t>{issuer_name}</w:t>
-      </w:r>
-    </w:p>
-    <w:p>
+        </w:rPr>
+        <w:tab/>
+      </w:r>
       <w:r>
         <w:rPr>
           <w:rFonts w:eastAsia="Arial" w:cs="Arial"/>
           <w:color w:val="000000" w:themeColor="text1"/>
         </w:rPr>
-        <w:t>Facility</w:t>
+        <w:tab/>
+        <w:t xml:space="preserve">: </w:t>
       </w:r>
       <w:r>
         <w:rPr>
@@ -18243,57 +18136,26 @@
         <w:tab/>
       </w:r>
       <w:r>
+        <w:t>[●]</w:t>
+      </w:r>
+    </w:p>
+    <w:p>
+      <w:r>
         <w:rPr>
           <w:rFonts w:eastAsia="Arial" w:cs="Arial"/>
           <w:color w:val="000000" w:themeColor="text1"/>
         </w:rPr>
-        <w:tab/>
+        <w:t>Facility Agreement:</w:t>
       </w:r>
       <w:r>
         <w:rPr>
           <w:rFonts w:eastAsia="Arial" w:cs="Arial"/>
           <w:color w:val="000000" w:themeColor="text1"/>
         </w:rPr>
-        <w:t xml:space="preserve">: </w:t>
-      </w:r>
-      <w:r>
-        <w:rPr>
-          <w:rFonts w:eastAsia="Arial" w:cs="Arial"/>
-          <w:color w:val="000000" w:themeColor="text1"/>
-        </w:rPr>
-        <w:tab/>
-      </w:r>
-      <w:r>
-        <w:rPr>
-          <w:rFonts w:eastAsia="Arial" w:cs="Arial"/>
-          <w:color w:val="000000" w:themeColor="text1"/>
-          <w:highlight w:val="yellow"/>
-        </w:rPr>
-        <w:t>{facility_description}</w:t>
-      </w:r>
-    </w:p>
-    <w:p>
-      <w:r>
-        <w:rPr>
-          <w:rFonts w:eastAsia="Arial" w:cs="Arial"/>
-          <w:color w:val="000000" w:themeColor="text1"/>
-        </w:rPr>
-        <w:t>Facility Agreement:</w:t>
-      </w:r>
-      <w:r>
-        <w:rPr>
-          <w:rFonts w:eastAsia="Arial" w:cs="Arial"/>
-          <w:color w:val="000000" w:themeColor="text1"/>
-        </w:rPr>
-        <w:tab/>
-      </w:r>
-      <w:r>
-        <w:rPr>
-          <w:rFonts w:eastAsia="Arial" w:cs="Arial"/>
-          <w:color w:val="000000" w:themeColor="text1"/>
-          <w:highlight w:val="yellow"/>
-        </w:rPr>
-        <w:t>{facility_agreement_date}</w:t>
+        <w:tab/>
+      </w:r>
+      <w:r>
+        <w:t>[●]</w:t>
       </w:r>
       <w:r>
         <w:rPr>
@@ -18320,22 +18182,23 @@
       </w:r>
       <w:r>
         <w:rPr>
-          <w:rFonts w:eastAsia="Arial" w:cs="Arial"/>
-          <w:color w:val="000000" w:themeColor="text1"/>
           <w:u w:val="single"/>
-          <w:lang w:val="en-US"/>
-          <w:highlight w:val="yellow"/>
-        </w:rPr>
-        <w:t>{letter_date}</w:t>
-      </w:r>
-      <w:r>
-        <w:rPr>
-          <w:rFonts w:eastAsia="Arial" w:cs="Arial"/>
-          <w:color w:val="000000" w:themeColor="text1"/>
+        </w:rPr>
+        <w:t>[●] (“</w:t>
+      </w:r>
+      <w:r>
+        <w:rPr>
+          <w:b/>
+          <w:bCs/>
           <w:u w:val="single"/>
-          <w:lang w:val="en-US"/>
-        </w:rPr>
-        <w:t xml:space="preserve"> (“Letter of Offer”)</w:t>
+        </w:rPr>
+        <w:t>Letter of Offer</w:t>
+      </w:r>
+      <w:r>
+        <w:rPr>
+          <w:u w:val="single"/>
+        </w:rPr>
+        <w:t>”)</w:t>
       </w:r>
     </w:p>
     <w:p>
@@ -19029,7 +18892,106 @@
           <w:b/>
           <w:bCs/>
         </w:rPr>
-        <w:t xml:space="preserve">THIS SALE CONTRACT is made on  </w:t>
+        <w:t>THIS SALE CONTRACT</w:t>
+      </w:r>
+      <w:r>
+        <w:t xml:space="preserve"> is made on </w:t>
+      </w:r>
+    </w:p>
+    <w:p>
+      <w:pPr>
+        <w:spacing w:after="0" w:line="276" w:lineRule="auto"/>
+      </w:pPr>
+    </w:p>
+    <w:p>
+      <w:pPr>
+        <w:spacing w:after="0" w:line="276" w:lineRule="auto"/>
+      </w:pPr>
+      <w:r>
+        <w:t>BETWEEN</w:t>
+      </w:r>
+    </w:p>
+    <w:p>
+      <w:pPr>
+        <w:spacing w:after="0" w:line="276" w:lineRule="auto"/>
+      </w:pPr>
+    </w:p>
+    <w:p>
+      <w:pPr>
+        <w:spacing w:after="0" w:line="276" w:lineRule="auto"/>
+        <w:jc w:val="both"/>
+      </w:pPr>
+      <w:r>
+        <w:rPr>
+          <w:b/>
+          <w:bCs/>
+        </w:rPr>
+        <w:t>SHORAKA SUYULA PLATFORM SDN. BHD. (Company No. 202101033028 [1433328-H])</w:t>
+      </w:r>
+      <w:r>
+        <w:t>, a company incorporated in Malaysia with its principal place of business at Level 19, Wisma Mont’ Kiara, No. 1, Jalan Kiara, Mont’ Kiara, 50480 Kuala Lumpur, Malaysia (the “</w:t>
+      </w:r>
+      <w:r>
+        <w:rPr>
+          <w:b/>
+          <w:bCs/>
+        </w:rPr>
+        <w:t>Agent</w:t>
+      </w:r>
+      <w:r>
+        <w:t>”) of the one part;</w:t>
+      </w:r>
+    </w:p>
+    <w:p>
+      <w:pPr>
+        <w:spacing w:after="0" w:line="276" w:lineRule="auto"/>
+        <w:jc w:val="both"/>
+        <w:rPr>
+          <w:b/>
+          <w:bCs/>
+        </w:rPr>
+      </w:pPr>
+    </w:p>
+    <w:p>
+      <w:pPr>
+        <w:spacing w:after="0" w:line="276" w:lineRule="auto"/>
+        <w:jc w:val="both"/>
+      </w:pPr>
+      <w:r>
+        <w:t>AND</w:t>
+      </w:r>
+    </w:p>
+    <w:p>
+      <w:pPr>
+        <w:spacing w:after="0" w:line="276" w:lineRule="auto"/>
+        <w:jc w:val="both"/>
+        <w:rPr>
+          <w:b/>
+          <w:bCs/>
+        </w:rPr>
+      </w:pPr>
+    </w:p>
+    <w:p>
+      <w:pPr>
+        <w:spacing w:after="0" w:line="276" w:lineRule="auto"/>
+        <w:jc w:val="both"/>
+        <w:rPr>
+          <w:b/>
+          <w:bCs/>
+        </w:rPr>
+      </w:pPr>
+    </w:p>
+    <w:p>
+      <w:pPr>
+        <w:spacing w:after="0" w:line="276" w:lineRule="auto"/>
+        <w:jc w:val="both"/>
+      </w:pPr>
+      <w:r>
+        <w:rPr>
+          <w:b/>
+          <w:bCs/>
+        </w:rPr>
+        <w:t>[</w:t>
       </w:r>
       <w:r>
         <w:rPr>
@@ -19037,141 +18999,51 @@
           <w:bCs/>
           <w:highlight w:val="yellow"/>
         </w:rPr>
-        <w:t>{facility_agreement_date}</w:t>
-      </w:r>
-    </w:p>
-    <w:p>
-      <w:pPr>
-        <w:spacing w:after="0" w:line="276" w:lineRule="auto"/>
-      </w:pPr>
-    </w:p>
-    <w:p>
-      <w:pPr>
-        <w:spacing w:after="0" w:line="276" w:lineRule="auto"/>
-      </w:pPr>
-      <w:r>
-        <w:t>BETWEEN</w:t>
-      </w:r>
-    </w:p>
-    <w:p>
-      <w:pPr>
-        <w:spacing w:after="0" w:line="276" w:lineRule="auto"/>
-      </w:pPr>
-    </w:p>
-    <w:p>
-      <w:pPr>
-        <w:spacing w:after="0" w:line="276" w:lineRule="auto"/>
-        <w:jc w:val="both"/>
-      </w:pPr>
-      <w:r>
-        <w:rPr>
-          <w:b/>
-          <w:bCs/>
-        </w:rPr>
-        <w:t>SHORAKA SUYULA PLATFORM SDN. BHD. (Company No. 202101033028 [1433328-H])</w:t>
-      </w:r>
-      <w:r>
-        <w:t>, a company incorporated in Malaysia with its principal place of business at Level 19, Wisma Mont’ Kiara, No. 1, Jalan Kiara, Mont’ Kiara, 50480 Kuala Lumpur, Malaysia (the “</w:t>
-      </w:r>
-      <w:r>
-        <w:rPr>
-          <w:b/>
-          <w:bCs/>
-        </w:rPr>
-        <w:t>Agent</w:t>
-      </w:r>
-      <w:r>
-        <w:t>”) of the one part;</w:t>
-      </w:r>
-    </w:p>
-    <w:p>
-      <w:pPr>
-        <w:spacing w:after="0" w:line="276" w:lineRule="auto"/>
-        <w:jc w:val="both"/>
-        <w:rPr>
-          <w:b/>
-          <w:bCs/>
-        </w:rPr>
-      </w:pPr>
-    </w:p>
-    <w:p>
-      <w:pPr>
-        <w:spacing w:after="0" w:line="276" w:lineRule="auto"/>
-        <w:jc w:val="both"/>
-      </w:pPr>
-      <w:r>
-        <w:t>AND</w:t>
-      </w:r>
-    </w:p>
-    <w:p>
-      <w:pPr>
-        <w:spacing w:after="0" w:line="276" w:lineRule="auto"/>
-        <w:jc w:val="both"/>
-        <w:rPr>
-          <w:b/>
-          <w:bCs/>
-        </w:rPr>
-      </w:pPr>
-    </w:p>
-    <w:p>
-      <w:pPr>
-        <w:spacing w:after="0" w:line="276" w:lineRule="auto"/>
-        <w:jc w:val="both"/>
-        <w:rPr>
-          <w:b/>
-          <w:bCs/>
-        </w:rPr>
-      </w:pPr>
-    </w:p>
-    <w:p>
-      <w:pPr>
-        <w:spacing w:after="0" w:line="276" w:lineRule="auto"/>
-        <w:jc w:val="both"/>
-      </w:pPr>
+        <w:t>ISSUER</w:t>
+      </w:r>
+      <w:r>
+        <w:rPr>
+          <w:b/>
+          <w:bCs/>
+        </w:rPr>
+        <w:t>] (Company No. [</w:t>
+      </w:r>
       <w:r>
         <w:rPr>
           <w:b/>
           <w:bCs/>
           <w:highlight w:val="yellow"/>
         </w:rPr>
-        <w:t>{issuer_name}</w:t>
-      </w:r>
-      <w:r>
-        <w:rPr>
-          <w:b/>
-          <w:bCs/>
-        </w:rPr>
-        <w:t xml:space="preserve"> (Company No. </w:t>
-      </w:r>
-      <w:r>
-        <w:rPr>
-          <w:b/>
-          <w:bCs/>
+        <w:t>insert</w:t>
+      </w:r>
+      <w:r>
+        <w:rPr>
+          <w:b/>
+          <w:bCs/>
+        </w:rPr>
+        <w:t>])</w:t>
+      </w:r>
+      <w:r>
+        <w:t>, a company incorporated under the laws of Malaysia having its principal place of business at [</w:t>
+      </w:r>
+      <w:r>
+        <w:rPr>
           <w:highlight w:val="yellow"/>
         </w:rPr>
-        <w:t>{issuer_registration_number}</w:t>
-      </w:r>
-      <w:r>
-        <w:rPr>
-          <w:b/>
-          <w:bCs/>
-        </w:rPr>
-        <w:t xml:space="preserve">), a company incorporated under the laws of Malaysia having its principal place of business at </w:t>
-      </w:r>
-      <w:r>
-        <w:rPr>
-          <w:b/>
-          <w:bCs/>
-          <w:highlight w:val="yellow"/>
-        </w:rPr>
-        <w:t>{issuer_address}</w:t>
-      </w:r>
-      <w:r>
-        <w:rPr>
-          <w:b/>
-          <w:bCs/>
-        </w:rPr>
-        <w:t xml:space="preserve"> (the “Issuer”) of the other part.</w:t>
+        <w:t>insert</w:t>
+      </w:r>
+      <w:r>
+        <w:t>] (the “</w:t>
+      </w:r>
+      <w:r>
+        <w:rPr>
+          <w:b/>
+          <w:bCs/>
+        </w:rPr>
+        <w:t>Issuer</w:t>
+      </w:r>
+      <w:r>
+        <w:t>”) of the other part.</w:t>
       </w:r>
     </w:p>
     <w:p>
@@ -19944,15 +19816,6 @@
             <w:pPr>
               <w:spacing w:line="276" w:lineRule="auto"/>
             </w:pPr>
-            <w:r>
-              <w:rPr>
-                <w:rFonts w:ascii="Arial" w:hAnsi="Arial"/>
-                <w:sz w:val="20"/>
-                <w:szCs w:val="20"/>
-                <w:highlight w:val="yellow"/>
-              </w:rPr>
-              <w:t>{facility_agreement_date}</w:t>
-            </w:r>
           </w:p>
         </w:tc>
         <w:tc>
@@ -19997,15 +19860,6 @@
             <w:pPr>
               <w:spacing w:line="276" w:lineRule="auto"/>
             </w:pPr>
-            <w:r>
-              <w:rPr>
-                <w:rFonts w:ascii="Arial" w:hAnsi="Arial"/>
-                <w:sz w:val="20"/>
-                <w:szCs w:val="20"/>
-                <w:highlight w:val="yellow"/>
-              </w:rPr>
-              <w:t>{issuer_name}</w:t>
-            </w:r>
           </w:p>
         </w:tc>
         <w:tc>

</xml_diff>

<commit_message>
feat: update facility agreement
- Add "as prescribed by Letter of Offer" for drawdown_fee.
- Add particular in Appendix 1.
</commit_message>
<xml_diff>
--- a/apps/api/src/modules/applications/templates/arf-facility-agreement.docx
+++ b/apps/api/src/modules/applications/templates/arf-facility-agreement.docx
@@ -19826,6 +19826,15 @@
             <w:pPr>
               <w:spacing w:line="276" w:lineRule="auto"/>
             </w:pPr>
+            <w:r>
+              <w:rPr>
+                <w:rFonts w:ascii="Arial" w:hAnsi="Arial"/>
+                <w:sz w:val="20"/>
+                <w:szCs w:val="20"/>
+                <w:highlight w:val="yellow"/>
+              </w:rPr>
+              <w:t>{facility_agreement_date}</w:t>
+            </w:r>
           </w:p>
         </w:tc>
       </w:tr>
@@ -19870,6 +19879,49 @@
             <w:pPr>
               <w:spacing w:line="276" w:lineRule="auto"/>
             </w:pPr>
+            <w:r>
+              <w:rPr>
+                <w:rFonts w:ascii="Arial" w:hAnsi="Arial"/>
+                <w:sz w:val="20"/>
+                <w:szCs w:val="20"/>
+                <w:highlight w:val="yellow"/>
+              </w:rPr>
+              <w:t>{issuer_name}</w:t>
+            </w:r>
+            <w:r>
+              <w:rPr>
+                <w:rFonts w:ascii="Arial" w:hAnsi="Arial"/>
+                <w:sz w:val="20"/>
+                <w:szCs w:val="20"/>
+              </w:rPr>
+              <w:t xml:space="preserve"> (Company No. </w:t>
+            </w:r>
+            <w:r>
+              <w:rPr>
+                <w:rFonts w:ascii="Arial" w:hAnsi="Arial"/>
+                <w:sz w:val="20"/>
+                <w:szCs w:val="20"/>
+                <w:highlight w:val="yellow"/>
+              </w:rPr>
+              <w:t>{issuer_registration_number}</w:t>
+            </w:r>
+            <w:r>
+              <w:rPr>
+                <w:rFonts w:ascii="Arial" w:hAnsi="Arial"/>
+                <w:sz w:val="20"/>
+                <w:szCs w:val="20"/>
+              </w:rPr>
+              <w:t xml:space="preserve">) of </w:t>
+            </w:r>
+            <w:r>
+              <w:rPr>
+                <w:rFonts w:ascii="Arial" w:hAnsi="Arial"/>
+                <w:sz w:val="20"/>
+                <w:szCs w:val="20"/>
+                <w:highlight w:val="yellow"/>
+              </w:rPr>
+              <w:t>{issuer_address}</w:t>
+            </w:r>
           </w:p>
         </w:tc>
       </w:tr>

</xml_diff>